<commit_message>
Ispravljena greska u project_charteru
</commit_message>
<xml_diff>
--- a/Dokumentacija/project_charter.docx
+++ b/Dokumentacija/project_charter.docx
@@ -11,95 +11,13 @@
           <w:szCs w:val="44"/>
         </w:rPr>
       </w:pPr>
-      <w:proofErr w:type="spellStart"/>
       <w:r>
         <w:rPr>
           <w:sz w:val="44"/>
           <w:szCs w:val="44"/>
         </w:rPr>
-        <w:t>Praćenje</w:t>
+        <w:t>Praćenje promene tipa zemljišta tokom vremena</w:t>
       </w:r>
-      <w:proofErr w:type="spellEnd"/>
-      <w:r>
-        <w:rPr>
-          <w:sz w:val="44"/>
-          <w:szCs w:val="44"/>
-        </w:rPr>
-        <w:t xml:space="preserve"> </w:t>
-      </w:r>
-      <w:proofErr w:type="spellStart"/>
-      <w:r>
-        <w:rPr>
-          <w:sz w:val="44"/>
-          <w:szCs w:val="44"/>
-        </w:rPr>
-        <w:t>promene</w:t>
-      </w:r>
-      <w:proofErr w:type="spellEnd"/>
-      <w:r>
-        <w:rPr>
-          <w:sz w:val="44"/>
-          <w:szCs w:val="44"/>
-        </w:rPr>
-        <w:t xml:space="preserve"> </w:t>
-      </w:r>
-      <w:proofErr w:type="spellStart"/>
-      <w:r>
-        <w:rPr>
-          <w:sz w:val="44"/>
-          <w:szCs w:val="44"/>
-        </w:rPr>
-        <w:t>tipa</w:t>
-      </w:r>
-      <w:proofErr w:type="spellEnd"/>
-      <w:r>
-        <w:rPr>
-          <w:sz w:val="44"/>
-          <w:szCs w:val="44"/>
-        </w:rPr>
-        <w:t xml:space="preserve"> </w:t>
-      </w:r>
-      <w:proofErr w:type="spellStart"/>
-      <w:r>
-        <w:rPr>
-          <w:sz w:val="44"/>
-          <w:szCs w:val="44"/>
-        </w:rPr>
-        <w:t>zemljišta</w:t>
-      </w:r>
-      <w:proofErr w:type="spellEnd"/>
-      <w:r>
-        <w:rPr>
-          <w:sz w:val="44"/>
-          <w:szCs w:val="44"/>
-        </w:rPr>
-        <w:t xml:space="preserve"> </w:t>
-      </w:r>
-      <w:proofErr w:type="spellStart"/>
-      <w:r>
-        <w:rPr>
-          <w:sz w:val="44"/>
-          <w:szCs w:val="44"/>
-        </w:rPr>
-        <w:t>tokom</w:t>
-      </w:r>
-      <w:proofErr w:type="spellEnd"/>
-      <w:r>
-        <w:rPr>
-          <w:sz w:val="44"/>
-          <w:szCs w:val="44"/>
-        </w:rPr>
-        <w:t xml:space="preserve"> </w:t>
-      </w:r>
-      <w:proofErr w:type="spellStart"/>
-      <w:r>
-        <w:rPr>
-          <w:sz w:val="44"/>
-          <w:szCs w:val="44"/>
-        </w:rPr>
-        <w:t>vremena</w:t>
-      </w:r>
-      <w:proofErr w:type="spellEnd"/>
     </w:p>
     <w:p>
       <w:pPr>
@@ -125,28 +43,12 @@
             <w:tcW w:w="4320" w:type="dxa"/>
           </w:tcPr>
           <w:p>
-            <w:proofErr w:type="spellStart"/>
             <w:r>
               <w:rPr>
                 <w:b/>
               </w:rPr>
-              <w:t>Naziv</w:t>
+              <w:t>Naziv projekta</w:t>
             </w:r>
-            <w:proofErr w:type="spellEnd"/>
-            <w:r>
-              <w:rPr>
-                <w:b/>
-              </w:rPr>
-              <w:t xml:space="preserve"> </w:t>
-            </w:r>
-            <w:proofErr w:type="spellStart"/>
-            <w:r>
-              <w:rPr>
-                <w:b/>
-              </w:rPr>
-              <w:t>projekta</w:t>
-            </w:r>
-            <w:proofErr w:type="spellEnd"/>
           </w:p>
         </w:tc>
         <w:tc>
@@ -154,51 +56,9 @@
             <w:tcW w:w="8404" w:type="dxa"/>
           </w:tcPr>
           <w:p>
-            <w:proofErr w:type="spellStart"/>
             <w:r>
-              <w:t>Praćenje</w:t>
+              <w:t>Praćenje promene tipa zemljišta tokom vremena</w:t>
             </w:r>
-            <w:proofErr w:type="spellEnd"/>
-            <w:r>
-              <w:t xml:space="preserve"> </w:t>
-            </w:r>
-            <w:proofErr w:type="spellStart"/>
-            <w:r>
-              <w:t>promene</w:t>
-            </w:r>
-            <w:proofErr w:type="spellEnd"/>
-            <w:r>
-              <w:t xml:space="preserve"> </w:t>
-            </w:r>
-            <w:proofErr w:type="spellStart"/>
-            <w:r>
-              <w:t>tipa</w:t>
-            </w:r>
-            <w:proofErr w:type="spellEnd"/>
-            <w:r>
-              <w:t xml:space="preserve"> </w:t>
-            </w:r>
-            <w:proofErr w:type="spellStart"/>
-            <w:r>
-              <w:t>zemljišta</w:t>
-            </w:r>
-            <w:proofErr w:type="spellEnd"/>
-            <w:r>
-              <w:t xml:space="preserve"> </w:t>
-            </w:r>
-            <w:proofErr w:type="spellStart"/>
-            <w:r>
-              <w:t>tokom</w:t>
-            </w:r>
-            <w:proofErr w:type="spellEnd"/>
-            <w:r>
-              <w:t xml:space="preserve"> </w:t>
-            </w:r>
-            <w:proofErr w:type="spellStart"/>
-            <w:r>
-              <w:t>vremena</w:t>
-            </w:r>
-            <w:proofErr w:type="spellEnd"/>
           </w:p>
         </w:tc>
       </w:tr>
@@ -208,28 +68,12 @@
             <w:tcW w:w="4320" w:type="dxa"/>
           </w:tcPr>
           <w:p>
-            <w:proofErr w:type="spellStart"/>
             <w:r>
               <w:rPr>
                 <w:b/>
               </w:rPr>
-              <w:t>Namena</w:t>
+              <w:t>Namena projekta</w:t>
             </w:r>
-            <w:proofErr w:type="spellEnd"/>
-            <w:r>
-              <w:rPr>
-                <w:b/>
-              </w:rPr>
-              <w:t xml:space="preserve"> </w:t>
-            </w:r>
-            <w:proofErr w:type="spellStart"/>
-            <w:r>
-              <w:rPr>
-                <w:b/>
-              </w:rPr>
-              <w:t>projekta</w:t>
-            </w:r>
-            <w:proofErr w:type="spellEnd"/>
           </w:p>
         </w:tc>
         <w:tc>
@@ -240,341 +84,8 @@
             <w:pPr>
               <w:pStyle w:val="NormalWeb"/>
             </w:pPr>
-            <w:proofErr w:type="spellStart"/>
             <w:r>
-              <w:t>Razvoj</w:t>
-            </w:r>
-            <w:proofErr w:type="spellEnd"/>
-            <w:r>
-              <w:t xml:space="preserve"> </w:t>
-            </w:r>
-            <w:proofErr w:type="spellStart"/>
-            <w:r>
-              <w:t>softverskog</w:t>
-            </w:r>
-            <w:proofErr w:type="spellEnd"/>
-            <w:r>
-              <w:t xml:space="preserve"> </w:t>
-            </w:r>
-            <w:proofErr w:type="spellStart"/>
-            <w:r>
-              <w:t>sistema</w:t>
-            </w:r>
-            <w:proofErr w:type="spellEnd"/>
-            <w:r>
-              <w:t xml:space="preserve"> za </w:t>
-            </w:r>
-            <w:proofErr w:type="spellStart"/>
-            <w:r>
-              <w:t>analizu</w:t>
-            </w:r>
-            <w:proofErr w:type="spellEnd"/>
-            <w:r>
-              <w:t xml:space="preserve"> </w:t>
-            </w:r>
-            <w:proofErr w:type="spellStart"/>
-            <w:r>
-              <w:t>i</w:t>
-            </w:r>
-            <w:proofErr w:type="spellEnd"/>
-            <w:r>
-              <w:t xml:space="preserve"> </w:t>
-            </w:r>
-            <w:proofErr w:type="spellStart"/>
-            <w:r>
-              <w:t>detekciju</w:t>
-            </w:r>
-            <w:proofErr w:type="spellEnd"/>
-            <w:r>
-              <w:t xml:space="preserve"> </w:t>
-            </w:r>
-            <w:proofErr w:type="spellStart"/>
-            <w:r>
-              <w:t>promena</w:t>
-            </w:r>
-            <w:proofErr w:type="spellEnd"/>
-            <w:r>
-              <w:t xml:space="preserve"> </w:t>
-            </w:r>
-            <w:proofErr w:type="spellStart"/>
-            <w:r>
-              <w:t>tipa</w:t>
-            </w:r>
-            <w:proofErr w:type="spellEnd"/>
-            <w:r>
-              <w:t xml:space="preserve"> </w:t>
-            </w:r>
-            <w:proofErr w:type="spellStart"/>
-            <w:r>
-              <w:t>zemljišta</w:t>
-            </w:r>
-            <w:proofErr w:type="spellEnd"/>
-            <w:r>
-              <w:t xml:space="preserve"> </w:t>
-            </w:r>
-            <w:proofErr w:type="spellStart"/>
-            <w:r>
-              <w:t>korišćenjem</w:t>
-            </w:r>
-            <w:proofErr w:type="spellEnd"/>
-            <w:r>
-              <w:t xml:space="preserve"> </w:t>
-            </w:r>
-            <w:proofErr w:type="spellStart"/>
-            <w:r>
-              <w:t>vremenskih</w:t>
-            </w:r>
-            <w:proofErr w:type="spellEnd"/>
-            <w:r>
-              <w:t xml:space="preserve"> </w:t>
-            </w:r>
-            <w:proofErr w:type="spellStart"/>
-            <w:r>
-              <w:t>serija</w:t>
-            </w:r>
-            <w:proofErr w:type="spellEnd"/>
-            <w:r>
-              <w:t xml:space="preserve"> </w:t>
-            </w:r>
-            <w:proofErr w:type="spellStart"/>
-            <w:r>
-              <w:t>snimaka</w:t>
-            </w:r>
-            <w:proofErr w:type="spellEnd"/>
-            <w:r>
-              <w:t xml:space="preserve"> </w:t>
-            </w:r>
-            <w:proofErr w:type="spellStart"/>
-            <w:r>
-              <w:t>dobijenih</w:t>
-            </w:r>
-            <w:proofErr w:type="spellEnd"/>
-            <w:r>
-              <w:t xml:space="preserve"> </w:t>
-            </w:r>
-            <w:proofErr w:type="spellStart"/>
-            <w:r>
-              <w:t>dronom</w:t>
-            </w:r>
-            <w:proofErr w:type="spellEnd"/>
-            <w:r>
-              <w:t xml:space="preserve">. </w:t>
-            </w:r>
-            <w:proofErr w:type="spellStart"/>
-            <w:r>
-              <w:t>Sistem</w:t>
-            </w:r>
-            <w:proofErr w:type="spellEnd"/>
-            <w:r>
-              <w:t xml:space="preserve"> </w:t>
-            </w:r>
-            <w:proofErr w:type="spellStart"/>
-            <w:r>
-              <w:t>će</w:t>
-            </w:r>
-            <w:proofErr w:type="spellEnd"/>
-            <w:r>
-              <w:t xml:space="preserve"> </w:t>
-            </w:r>
-            <w:proofErr w:type="spellStart"/>
-            <w:r>
-              <w:t>analizirati</w:t>
-            </w:r>
-            <w:proofErr w:type="spellEnd"/>
-            <w:r>
-              <w:t xml:space="preserve"> </w:t>
-            </w:r>
-            <w:proofErr w:type="spellStart"/>
-            <w:r>
-              <w:t>dva</w:t>
-            </w:r>
-            <w:proofErr w:type="spellEnd"/>
-            <w:r>
-              <w:t xml:space="preserve"> </w:t>
-            </w:r>
-            <w:proofErr w:type="spellStart"/>
-            <w:r>
-              <w:t>ili</w:t>
-            </w:r>
-            <w:proofErr w:type="spellEnd"/>
-            <w:r>
-              <w:t xml:space="preserve"> </w:t>
-            </w:r>
-            <w:proofErr w:type="spellStart"/>
-            <w:r>
-              <w:t>više</w:t>
-            </w:r>
-            <w:proofErr w:type="spellEnd"/>
-            <w:r>
-              <w:t xml:space="preserve"> </w:t>
-            </w:r>
-            <w:proofErr w:type="spellStart"/>
-            <w:r>
-              <w:t>snimaka</w:t>
-            </w:r>
-            <w:proofErr w:type="spellEnd"/>
-            <w:r>
-              <w:t xml:space="preserve"> </w:t>
-            </w:r>
-            <w:proofErr w:type="spellStart"/>
-            <w:r>
-              <w:t>istog</w:t>
-            </w:r>
-            <w:proofErr w:type="spellEnd"/>
-            <w:r>
-              <w:t xml:space="preserve"> </w:t>
-            </w:r>
-            <w:proofErr w:type="spellStart"/>
-            <w:r>
-              <w:t>geografskog</w:t>
-            </w:r>
-            <w:proofErr w:type="spellEnd"/>
-            <w:r>
-              <w:t xml:space="preserve"> </w:t>
-            </w:r>
-            <w:proofErr w:type="spellStart"/>
-            <w:r>
-              <w:t>područja</w:t>
-            </w:r>
-            <w:proofErr w:type="spellEnd"/>
-            <w:r>
-              <w:t xml:space="preserve"> u </w:t>
-            </w:r>
-            <w:proofErr w:type="spellStart"/>
-            <w:r>
-              <w:t>različitim</w:t>
-            </w:r>
-            <w:proofErr w:type="spellEnd"/>
-            <w:r>
-              <w:t xml:space="preserve"> </w:t>
-            </w:r>
-            <w:proofErr w:type="spellStart"/>
-            <w:r>
-              <w:t>vremenskim</w:t>
-            </w:r>
-            <w:proofErr w:type="spellEnd"/>
-            <w:r>
-              <w:t xml:space="preserve"> </w:t>
-            </w:r>
-            <w:proofErr w:type="spellStart"/>
-            <w:r>
-              <w:t>trenucima</w:t>
-            </w:r>
-            <w:proofErr w:type="spellEnd"/>
-            <w:r>
-              <w:t xml:space="preserve"> </w:t>
-            </w:r>
-            <w:proofErr w:type="spellStart"/>
-            <w:r>
-              <w:t>kako</w:t>
-            </w:r>
-            <w:proofErr w:type="spellEnd"/>
-            <w:r>
-              <w:t xml:space="preserve"> </w:t>
-            </w:r>
-            <w:proofErr w:type="spellStart"/>
-            <w:r>
-              <w:t>bi</w:t>
-            </w:r>
-            <w:proofErr w:type="spellEnd"/>
-            <w:r>
-              <w:t xml:space="preserve"> </w:t>
-            </w:r>
-            <w:proofErr w:type="spellStart"/>
-            <w:r>
-              <w:t>identifikovao</w:t>
-            </w:r>
-            <w:proofErr w:type="spellEnd"/>
-            <w:r>
-              <w:t xml:space="preserve"> </w:t>
-            </w:r>
-            <w:proofErr w:type="spellStart"/>
-            <w:r>
-              <w:t>promene</w:t>
-            </w:r>
-            <w:proofErr w:type="spellEnd"/>
-            <w:r>
-              <w:t xml:space="preserve"> u </w:t>
-            </w:r>
-            <w:proofErr w:type="spellStart"/>
-            <w:r>
-              <w:t>tipu</w:t>
-            </w:r>
-            <w:proofErr w:type="spellEnd"/>
-            <w:r>
-              <w:t xml:space="preserve"> </w:t>
-            </w:r>
-            <w:proofErr w:type="spellStart"/>
-            <w:r>
-              <w:t>zemljišta</w:t>
-            </w:r>
-            <w:proofErr w:type="spellEnd"/>
-            <w:r>
-              <w:t xml:space="preserve"> (</w:t>
-            </w:r>
-            <w:proofErr w:type="spellStart"/>
-            <w:r>
-              <w:t>na</w:t>
-            </w:r>
-            <w:proofErr w:type="spellEnd"/>
-            <w:r>
-              <w:t xml:space="preserve"> primer </w:t>
-            </w:r>
-            <w:proofErr w:type="spellStart"/>
-            <w:r>
-              <w:t>promena</w:t>
-            </w:r>
-            <w:proofErr w:type="spellEnd"/>
-            <w:r>
-              <w:t xml:space="preserve"> </w:t>
-            </w:r>
-            <w:proofErr w:type="spellStart"/>
-            <w:r>
-              <w:t>šume</w:t>
-            </w:r>
-            <w:proofErr w:type="spellEnd"/>
-            <w:r>
-              <w:t xml:space="preserve"> u </w:t>
-            </w:r>
-            <w:proofErr w:type="spellStart"/>
-            <w:r>
-              <w:t>poljoprivredno</w:t>
-            </w:r>
-            <w:proofErr w:type="spellEnd"/>
-            <w:r>
-              <w:t xml:space="preserve"> </w:t>
-            </w:r>
-            <w:proofErr w:type="spellStart"/>
-            <w:r>
-              <w:t>zemljište</w:t>
-            </w:r>
-            <w:proofErr w:type="spellEnd"/>
-            <w:r>
-              <w:t xml:space="preserve"> </w:t>
-            </w:r>
-            <w:proofErr w:type="spellStart"/>
-            <w:r>
-              <w:t>ili</w:t>
-            </w:r>
-            <w:proofErr w:type="spellEnd"/>
-            <w:r>
-              <w:t xml:space="preserve"> </w:t>
-            </w:r>
-            <w:proofErr w:type="spellStart"/>
-            <w:r>
-              <w:t>urbanizovanu</w:t>
-            </w:r>
-            <w:proofErr w:type="spellEnd"/>
-            <w:r>
-              <w:t xml:space="preserve"> </w:t>
-            </w:r>
-            <w:proofErr w:type="spellStart"/>
-            <w:r>
-              <w:t>površinu</w:t>
-            </w:r>
-            <w:proofErr w:type="spellEnd"/>
-            <w:r>
-              <w:t>).</w:t>
+              <w:t>Razvoj softverskog sistema za analizu i detekciju promena tipa zemljišta korišćenjem vremenskih serija snimaka dobijenih dronom. Sistem će analizirati dva ili više snimaka istog geografskog područja u različitim vremenskim trenucima kako bi identifikovao promene u tipu zemljišta (na primer promena šume u poljoprivredno zemljište ili urbanizovanu površinu).</w:t>
             </w:r>
           </w:p>
         </w:tc>
@@ -585,28 +96,12 @@
             <w:tcW w:w="4320" w:type="dxa"/>
           </w:tcPr>
           <w:p>
-            <w:proofErr w:type="spellStart"/>
             <w:r>
               <w:rPr>
                 <w:b/>
               </w:rPr>
-              <w:t>Ciljevi</w:t>
+              <w:t>Ciljevi projekta</w:t>
             </w:r>
-            <w:proofErr w:type="spellEnd"/>
-            <w:r>
-              <w:rPr>
-                <w:b/>
-              </w:rPr>
-              <w:t xml:space="preserve"> </w:t>
-            </w:r>
-            <w:proofErr w:type="spellStart"/>
-            <w:r>
-              <w:rPr>
-                <w:b/>
-              </w:rPr>
-              <w:t>projekta</w:t>
-            </w:r>
-            <w:proofErr w:type="spellEnd"/>
           </w:p>
         </w:tc>
         <w:tc>
@@ -621,79 +116,7 @@
               <w:t>❖</w:t>
             </w:r>
             <w:r>
-              <w:t xml:space="preserve"> </w:t>
-            </w:r>
-            <w:proofErr w:type="spellStart"/>
-            <w:r>
-              <w:t>Razvoj</w:t>
-            </w:r>
-            <w:proofErr w:type="spellEnd"/>
-            <w:r>
-              <w:t xml:space="preserve"> </w:t>
-            </w:r>
-            <w:proofErr w:type="spellStart"/>
-            <w:r>
-              <w:t>algoritma</w:t>
-            </w:r>
-            <w:proofErr w:type="spellEnd"/>
-            <w:r>
-              <w:t xml:space="preserve"> za </w:t>
-            </w:r>
-            <w:proofErr w:type="spellStart"/>
-            <w:r>
-              <w:t>detekciju</w:t>
-            </w:r>
-            <w:proofErr w:type="spellEnd"/>
-            <w:r>
-              <w:t xml:space="preserve"> </w:t>
-            </w:r>
-            <w:proofErr w:type="spellStart"/>
-            <w:r>
-              <w:t>promene</w:t>
-            </w:r>
-            <w:proofErr w:type="spellEnd"/>
-            <w:r>
-              <w:t xml:space="preserve"> </w:t>
-            </w:r>
-            <w:proofErr w:type="spellStart"/>
-            <w:r>
-              <w:t>tipa</w:t>
-            </w:r>
-            <w:proofErr w:type="spellEnd"/>
-            <w:r>
-              <w:t xml:space="preserve"> </w:t>
-            </w:r>
-            <w:proofErr w:type="spellStart"/>
-            <w:r>
-              <w:t>zemljišta</w:t>
-            </w:r>
-            <w:proofErr w:type="spellEnd"/>
-            <w:r>
-              <w:t xml:space="preserve"> </w:t>
-            </w:r>
-            <w:proofErr w:type="spellStart"/>
-            <w:r>
-              <w:t>korišćenjem</w:t>
-            </w:r>
-            <w:proofErr w:type="spellEnd"/>
-            <w:r>
-              <w:t xml:space="preserve"> </w:t>
-            </w:r>
-            <w:proofErr w:type="spellStart"/>
-            <w:r>
-              <w:t>dron</w:t>
-            </w:r>
-            <w:proofErr w:type="spellEnd"/>
-            <w:r>
-              <w:t xml:space="preserve"> </w:t>
-            </w:r>
-            <w:proofErr w:type="spellStart"/>
-            <w:r>
-              <w:t>snimaka</w:t>
-            </w:r>
-            <w:proofErr w:type="spellEnd"/>
-            <w:r>
-              <w:t>.</w:t>
+              <w:t xml:space="preserve"> Razvoj algoritma za detekciju promene tipa zemljišta korišćenjem dron snimaka.</w:t>
             </w:r>
             <w:r>
               <w:br/>
@@ -705,87 +128,7 @@
               <w:t>❖</w:t>
             </w:r>
             <w:r>
-              <w:t xml:space="preserve"> </w:t>
-            </w:r>
-            <w:proofErr w:type="spellStart"/>
-            <w:r>
-              <w:t>Implementacija</w:t>
-            </w:r>
-            <w:proofErr w:type="spellEnd"/>
-            <w:r>
-              <w:t xml:space="preserve"> </w:t>
-            </w:r>
-            <w:proofErr w:type="spellStart"/>
-            <w:r>
-              <w:t>metoda</w:t>
-            </w:r>
-            <w:proofErr w:type="spellEnd"/>
-            <w:r>
-              <w:t xml:space="preserve"> za </w:t>
-            </w:r>
-            <w:proofErr w:type="spellStart"/>
-            <w:r>
-              <w:t>registraciju</w:t>
-            </w:r>
-            <w:proofErr w:type="spellEnd"/>
-            <w:r>
-              <w:t xml:space="preserve"> </w:t>
-            </w:r>
-            <w:proofErr w:type="spellStart"/>
-            <w:r>
-              <w:t>i</w:t>
-            </w:r>
-            <w:proofErr w:type="spellEnd"/>
-            <w:r>
-              <w:t xml:space="preserve"> </w:t>
-            </w:r>
-            <w:proofErr w:type="spellStart"/>
-            <w:r>
-              <w:t>poravnanje</w:t>
-            </w:r>
-            <w:proofErr w:type="spellEnd"/>
-            <w:r>
-              <w:t xml:space="preserve"> </w:t>
-            </w:r>
-            <w:proofErr w:type="spellStart"/>
-            <w:r>
-              <w:t>slika</w:t>
-            </w:r>
-            <w:proofErr w:type="spellEnd"/>
-            <w:r>
-              <w:t xml:space="preserve"> </w:t>
-            </w:r>
-            <w:proofErr w:type="spellStart"/>
-            <w:r>
-              <w:t>snimljenih</w:t>
-            </w:r>
-            <w:proofErr w:type="spellEnd"/>
-            <w:r>
-              <w:t xml:space="preserve"> u </w:t>
-            </w:r>
-            <w:proofErr w:type="spellStart"/>
-            <w:r>
-              <w:t>različitim</w:t>
-            </w:r>
-            <w:proofErr w:type="spellEnd"/>
-            <w:r>
-              <w:t xml:space="preserve"> </w:t>
-            </w:r>
-            <w:proofErr w:type="spellStart"/>
-            <w:r>
-              <w:t>vremenskim</w:t>
-            </w:r>
-            <w:proofErr w:type="spellEnd"/>
-            <w:r>
-              <w:t xml:space="preserve"> </w:t>
-            </w:r>
-            <w:proofErr w:type="spellStart"/>
-            <w:r>
-              <w:t>trenucima</w:t>
-            </w:r>
-            <w:proofErr w:type="spellEnd"/>
-            <w:r>
-              <w:t>.</w:t>
+              <w:t xml:space="preserve"> Implementacija metoda za registraciju i poravnanje slika snimljenih u različitim vremenskim trenucima.</w:t>
             </w:r>
             <w:r>
               <w:br/>
@@ -797,63 +140,7 @@
               <w:t>❖</w:t>
             </w:r>
             <w:r>
-              <w:t xml:space="preserve"> Analiza </w:t>
-            </w:r>
-            <w:proofErr w:type="spellStart"/>
-            <w:r>
-              <w:t>razlike</w:t>
-            </w:r>
-            <w:proofErr w:type="spellEnd"/>
-            <w:r>
-              <w:t xml:space="preserve"> </w:t>
-            </w:r>
-            <w:proofErr w:type="spellStart"/>
-            <w:r>
-              <w:t>između</w:t>
-            </w:r>
-            <w:proofErr w:type="spellEnd"/>
-            <w:r>
-              <w:t xml:space="preserve"> </w:t>
-            </w:r>
-            <w:proofErr w:type="spellStart"/>
-            <w:r>
-              <w:t>snimaka</w:t>
-            </w:r>
-            <w:proofErr w:type="spellEnd"/>
-            <w:r>
-              <w:t xml:space="preserve"> </w:t>
-            </w:r>
-            <w:proofErr w:type="spellStart"/>
-            <w:r>
-              <w:t>i</w:t>
-            </w:r>
-            <w:proofErr w:type="spellEnd"/>
-            <w:r>
-              <w:t xml:space="preserve"> </w:t>
-            </w:r>
-            <w:proofErr w:type="spellStart"/>
-            <w:r>
-              <w:t>generisanje</w:t>
-            </w:r>
-            <w:proofErr w:type="spellEnd"/>
-            <w:r>
-              <w:t xml:space="preserve"> </w:t>
-            </w:r>
-            <w:proofErr w:type="spellStart"/>
-            <w:r>
-              <w:t>maske</w:t>
-            </w:r>
-            <w:proofErr w:type="spellEnd"/>
-            <w:r>
-              <w:t xml:space="preserve"> </w:t>
-            </w:r>
-            <w:proofErr w:type="spellStart"/>
-            <w:r>
-              <w:t>promena</w:t>
-            </w:r>
-            <w:proofErr w:type="spellEnd"/>
-            <w:r>
-              <w:t>.</w:t>
+              <w:t xml:space="preserve"> Analiza razlike između snimaka i generisanje maske promena.</w:t>
             </w:r>
             <w:r>
               <w:br/>
@@ -865,63 +152,7 @@
               <w:t>❖</w:t>
             </w:r>
             <w:r>
-              <w:t xml:space="preserve"> </w:t>
-            </w:r>
-            <w:proofErr w:type="spellStart"/>
-            <w:r>
-              <w:t>Vizuelizacija</w:t>
-            </w:r>
-            <w:proofErr w:type="spellEnd"/>
-            <w:r>
-              <w:t xml:space="preserve"> </w:t>
-            </w:r>
-            <w:proofErr w:type="spellStart"/>
-            <w:r>
-              <w:t>promena</w:t>
-            </w:r>
-            <w:proofErr w:type="spellEnd"/>
-            <w:r>
-              <w:t xml:space="preserve"> </w:t>
-            </w:r>
-            <w:proofErr w:type="spellStart"/>
-            <w:r>
-              <w:t>i</w:t>
-            </w:r>
-            <w:proofErr w:type="spellEnd"/>
-            <w:r>
-              <w:t xml:space="preserve"> </w:t>
-            </w:r>
-            <w:proofErr w:type="spellStart"/>
-            <w:r>
-              <w:t>izračunavanje</w:t>
-            </w:r>
-            <w:proofErr w:type="spellEnd"/>
-            <w:r>
-              <w:t xml:space="preserve"> </w:t>
-            </w:r>
-            <w:proofErr w:type="spellStart"/>
-            <w:r>
-              <w:t>procentualne</w:t>
-            </w:r>
-            <w:proofErr w:type="spellEnd"/>
-            <w:r>
-              <w:t xml:space="preserve"> </w:t>
-            </w:r>
-            <w:proofErr w:type="spellStart"/>
-            <w:r>
-              <w:t>promene</w:t>
-            </w:r>
-            <w:proofErr w:type="spellEnd"/>
-            <w:r>
-              <w:t xml:space="preserve"> </w:t>
-            </w:r>
-            <w:proofErr w:type="spellStart"/>
-            <w:r>
-              <w:t>zemljišta</w:t>
-            </w:r>
-            <w:proofErr w:type="spellEnd"/>
-            <w:r>
-              <w:t>.</w:t>
+              <w:t xml:space="preserve"> Vizuelizacija promena i izračunavanje procentualne promene zemljišta.</w:t>
             </w:r>
             <w:r>
               <w:br/>
@@ -933,183 +164,7 @@
               <w:t>❖</w:t>
             </w:r>
             <w:r>
-              <w:t xml:space="preserve"> </w:t>
-            </w:r>
-            <w:proofErr w:type="spellStart"/>
-            <w:r>
-              <w:t>Razvoj</w:t>
-            </w:r>
-            <w:proofErr w:type="spellEnd"/>
-            <w:r>
-              <w:t xml:space="preserve"> </w:t>
-            </w:r>
-            <w:proofErr w:type="spellStart"/>
-            <w:r>
-              <w:t>modularnog</w:t>
-            </w:r>
-            <w:proofErr w:type="spellEnd"/>
-            <w:r>
-              <w:t xml:space="preserve"> </w:t>
-            </w:r>
-            <w:proofErr w:type="spellStart"/>
-            <w:r>
-              <w:t>softvera</w:t>
-            </w:r>
-            <w:proofErr w:type="spellEnd"/>
-            <w:r>
-              <w:t xml:space="preserve"> koji </w:t>
-            </w:r>
-            <w:proofErr w:type="spellStart"/>
-            <w:r>
-              <w:t>može</w:t>
-            </w:r>
-            <w:proofErr w:type="spellEnd"/>
-            <w:r>
-              <w:t xml:space="preserve"> </w:t>
-            </w:r>
-            <w:proofErr w:type="spellStart"/>
-            <w:r>
-              <w:t>raditi</w:t>
-            </w:r>
-            <w:proofErr w:type="spellEnd"/>
-            <w:r>
-              <w:t xml:space="preserve"> </w:t>
-            </w:r>
-            <w:proofErr w:type="spellStart"/>
-            <w:r>
-              <w:t>na</w:t>
-            </w:r>
-            <w:proofErr w:type="spellEnd"/>
-            <w:r>
-              <w:t xml:space="preserve"> </w:t>
-            </w:r>
-            <w:proofErr w:type="spellStart"/>
-            <w:r>
-              <w:t>računaru</w:t>
-            </w:r>
-            <w:proofErr w:type="spellEnd"/>
-            <w:r>
-              <w:t xml:space="preserve"> </w:t>
-            </w:r>
-            <w:proofErr w:type="spellStart"/>
-            <w:r>
-              <w:t>i</w:t>
-            </w:r>
-            <w:proofErr w:type="spellEnd"/>
-            <w:r>
-              <w:t xml:space="preserve"> ARM </w:t>
-            </w:r>
-            <w:proofErr w:type="spellStart"/>
-            <w:r>
-              <w:t>platformama</w:t>
-            </w:r>
-            <w:proofErr w:type="spellEnd"/>
-            <w:r>
-              <w:t>.</w:t>
-            </w:r>
-          </w:p>
-        </w:tc>
-      </w:tr>
-      <w:tr>
-        <w:tc>
-          <w:tcPr>
-            <w:tcW w:w="4320" w:type="dxa"/>
-          </w:tcPr>
-          <w:p>
-            <w:proofErr w:type="spellStart"/>
-            <w:r>
-              <w:rPr>
-                <w:b/>
-              </w:rPr>
-              <w:t>Klijent</w:t>
-            </w:r>
-            <w:proofErr w:type="spellEnd"/>
-          </w:p>
-        </w:tc>
-        <w:tc>
-          <w:tcPr>
-            <w:tcW w:w="8404" w:type="dxa"/>
-          </w:tcPr>
-          <w:p>
-            <w:proofErr w:type="spellStart"/>
-            <w:r>
-              <w:t>Univerzitet</w:t>
-            </w:r>
-            <w:proofErr w:type="spellEnd"/>
-            <w:r>
-              <w:t xml:space="preserve"> u </w:t>
-            </w:r>
-            <w:proofErr w:type="spellStart"/>
-            <w:r>
-              <w:t>Kragujevcu</w:t>
-            </w:r>
-            <w:proofErr w:type="spellEnd"/>
-            <w:r>
-              <w:t xml:space="preserve"> – </w:t>
-            </w:r>
-            <w:proofErr w:type="spellStart"/>
-            <w:r>
-              <w:t>Fakultet</w:t>
-            </w:r>
-            <w:proofErr w:type="spellEnd"/>
-            <w:r>
-              <w:t xml:space="preserve"> (</w:t>
-            </w:r>
-            <w:proofErr w:type="spellStart"/>
-            <w:r>
-              <w:t>predmet</w:t>
-            </w:r>
-            <w:proofErr w:type="spellEnd"/>
-            <w:r>
-              <w:t xml:space="preserve"> </w:t>
-            </w:r>
-            <w:proofErr w:type="spellStart"/>
-            <w:r>
-              <w:t>iz</w:t>
-            </w:r>
-            <w:proofErr w:type="spellEnd"/>
-            <w:r>
-              <w:t xml:space="preserve"> </w:t>
-            </w:r>
-            <w:proofErr w:type="spellStart"/>
-            <w:r>
-              <w:t>oblasti</w:t>
-            </w:r>
-            <w:proofErr w:type="spellEnd"/>
-            <w:r>
-              <w:t xml:space="preserve"> </w:t>
-            </w:r>
-            <w:proofErr w:type="spellStart"/>
-            <w:r>
-              <w:t>veštačke</w:t>
-            </w:r>
-            <w:proofErr w:type="spellEnd"/>
-            <w:r>
-              <w:t xml:space="preserve"> </w:t>
-            </w:r>
-            <w:proofErr w:type="spellStart"/>
-            <w:r>
-              <w:t>inteligencije</w:t>
-            </w:r>
-            <w:proofErr w:type="spellEnd"/>
-            <w:r>
-              <w:t xml:space="preserve"> / </w:t>
-            </w:r>
-            <w:proofErr w:type="spellStart"/>
-            <w:r>
-              <w:t>obrade</w:t>
-            </w:r>
-            <w:proofErr w:type="spellEnd"/>
-            <w:r>
-              <w:t xml:space="preserve"> </w:t>
-            </w:r>
-            <w:proofErr w:type="spellStart"/>
-            <w:r>
-              <w:t>slike</w:t>
-            </w:r>
-            <w:proofErr w:type="spellEnd"/>
-            <w:r>
-              <w:t>)</w:t>
+              <w:t xml:space="preserve"> Razvoj modularnog softvera koji može raditi na računaru i ARM platformama.</w:t>
             </w:r>
           </w:p>
         </w:tc>
@@ -1124,16 +179,33 @@
               <w:rPr>
                 <w:b/>
               </w:rPr>
-              <w:t xml:space="preserve">Projekt </w:t>
+              <w:t>Klijent</w:t>
             </w:r>
-            <w:proofErr w:type="spellStart"/>
+          </w:p>
+        </w:tc>
+        <w:tc>
+          <w:tcPr>
+            <w:tcW w:w="8404" w:type="dxa"/>
+          </w:tcPr>
+          <w:p>
+            <w:r>
+              <w:t>Univerzitet u Kragujevcu – Fakultet (predmet iz oblasti veštačke inteligencije / obrade slike)</w:t>
+            </w:r>
+          </w:p>
+        </w:tc>
+      </w:tr>
+      <w:tr>
+        <w:tc>
+          <w:tcPr>
+            <w:tcW w:w="4320" w:type="dxa"/>
+          </w:tcPr>
+          <w:p>
             <w:r>
               <w:rPr>
                 <w:b/>
               </w:rPr>
-              <w:t>menadžer</w:t>
+              <w:t>Projekt menadžer</w:t>
             </w:r>
-            <w:proofErr w:type="spellEnd"/>
           </w:p>
         </w:tc>
         <w:tc>
@@ -1153,28 +225,12 @@
             <w:tcW w:w="4320" w:type="dxa"/>
           </w:tcPr>
           <w:p>
-            <w:proofErr w:type="spellStart"/>
             <w:r>
               <w:rPr>
                 <w:b/>
               </w:rPr>
-              <w:t>Projektni</w:t>
+              <w:t>Projektni tim</w:t>
             </w:r>
-            <w:proofErr w:type="spellEnd"/>
-            <w:r>
-              <w:rPr>
-                <w:b/>
-              </w:rPr>
-              <w:t xml:space="preserve"> </w:t>
-            </w:r>
-            <w:proofErr w:type="spellStart"/>
-            <w:r>
-              <w:rPr>
-                <w:b/>
-              </w:rPr>
-              <w:t>tim</w:t>
-            </w:r>
-            <w:proofErr w:type="spellEnd"/>
           </w:p>
         </w:tc>
         <w:tc>
@@ -1182,6 +238,11 @@
             <w:tcW w:w="8404" w:type="dxa"/>
           </w:tcPr>
           <w:p>
+            <w:pPr>
+              <w:rPr>
+                <w:lang w:val="sr-Latn-RS"/>
+              </w:rPr>
+            </w:pPr>
             <w:r>
               <w:t>Mihailo Obradović</w:t>
             </w:r>
@@ -1195,7 +256,13 @@
               <w:t xml:space="preserve">, </w:t>
             </w:r>
             <w:r>
-              <w:t>Cone</w:t>
+              <w:t>Nemanja Aleksi</w:t>
+            </w:r>
+            <w:r>
+              <w:rPr>
+                <w:lang w:val="sr-Latn-RS"/>
+              </w:rPr>
+              <w:t>ć</w:t>
             </w:r>
           </w:p>
         </w:tc>
@@ -1206,28 +273,12 @@
             <w:tcW w:w="4320" w:type="dxa"/>
           </w:tcPr>
           <w:p>
-            <w:proofErr w:type="spellStart"/>
             <w:r>
               <w:rPr>
                 <w:b/>
               </w:rPr>
-              <w:t>Ključni</w:t>
+              <w:t>Ključni događaji</w:t>
             </w:r>
-            <w:proofErr w:type="spellEnd"/>
-            <w:r>
-              <w:rPr>
-                <w:b/>
-              </w:rPr>
-              <w:t xml:space="preserve"> </w:t>
-            </w:r>
-            <w:proofErr w:type="spellStart"/>
-            <w:r>
-              <w:rPr>
-                <w:b/>
-              </w:rPr>
-              <w:t>događaji</w:t>
-            </w:r>
-            <w:proofErr w:type="spellEnd"/>
           </w:p>
         </w:tc>
         <w:tc>
@@ -1236,223 +287,23 @@
           </w:tcPr>
           <w:p>
             <w:r>
-              <w:t xml:space="preserve">→ Analiza </w:t>
-            </w:r>
-            <w:proofErr w:type="spellStart"/>
-            <w:r>
-              <w:t>problema</w:t>
-            </w:r>
-            <w:proofErr w:type="spellEnd"/>
-            <w:r>
-              <w:t xml:space="preserve"> </w:t>
-            </w:r>
-            <w:proofErr w:type="spellStart"/>
-            <w:r>
-              <w:t>i</w:t>
-            </w:r>
-            <w:proofErr w:type="spellEnd"/>
-            <w:r>
-              <w:t xml:space="preserve"> </w:t>
-            </w:r>
-            <w:proofErr w:type="spellStart"/>
-            <w:r>
-              <w:t>prikupljanje</w:t>
-            </w:r>
-            <w:proofErr w:type="spellEnd"/>
-            <w:r>
-              <w:t xml:space="preserve"> </w:t>
-            </w:r>
-            <w:proofErr w:type="spellStart"/>
-            <w:r>
-              <w:t>snimaka</w:t>
-            </w:r>
-            <w:proofErr w:type="spellEnd"/>
-            <w:r>
-              <w:t xml:space="preserve"> (</w:t>
-            </w:r>
-            <w:proofErr w:type="spellStart"/>
-            <w:r>
-              <w:t>april</w:t>
-            </w:r>
-            <w:proofErr w:type="spellEnd"/>
-            <w:r>
-              <w:t xml:space="preserve"> 2026.)</w:t>
+              <w:t>→ Analiza problema i prikupljanje snimaka (april 2026.)</w:t>
             </w:r>
             <w:r>
               <w:br/>
-              <w:t xml:space="preserve">→ </w:t>
-            </w:r>
-            <w:proofErr w:type="spellStart"/>
-            <w:r>
-              <w:t>Razvoj</w:t>
-            </w:r>
-            <w:proofErr w:type="spellEnd"/>
-            <w:r>
-              <w:t xml:space="preserve"> </w:t>
-            </w:r>
-            <w:proofErr w:type="spellStart"/>
-            <w:r>
-              <w:t>algoritma</w:t>
-            </w:r>
-            <w:proofErr w:type="spellEnd"/>
-            <w:r>
-              <w:t xml:space="preserve"> za </w:t>
-            </w:r>
-            <w:proofErr w:type="spellStart"/>
-            <w:r>
-              <w:t>registraciju</w:t>
-            </w:r>
-            <w:proofErr w:type="spellEnd"/>
-            <w:r>
-              <w:t xml:space="preserve"> </w:t>
-            </w:r>
-            <w:proofErr w:type="spellStart"/>
-            <w:r>
-              <w:t>slika</w:t>
-            </w:r>
-            <w:proofErr w:type="spellEnd"/>
-            <w:r>
-              <w:t xml:space="preserve"> (</w:t>
-            </w:r>
-            <w:proofErr w:type="spellStart"/>
-            <w:r>
-              <w:t>maj</w:t>
-            </w:r>
-            <w:proofErr w:type="spellEnd"/>
-            <w:r>
-              <w:t xml:space="preserve"> 2026.)</w:t>
+              <w:t>→ Razvoj algoritma za registraciju slika (maj 2026.)</w:t>
             </w:r>
             <w:r>
               <w:br/>
-              <w:t xml:space="preserve">→ </w:t>
-            </w:r>
-            <w:proofErr w:type="spellStart"/>
-            <w:r>
-              <w:t>Implementacija</w:t>
-            </w:r>
-            <w:proofErr w:type="spellEnd"/>
-            <w:r>
-              <w:t xml:space="preserve"> </w:t>
-            </w:r>
-            <w:proofErr w:type="spellStart"/>
-            <w:r>
-              <w:t>detekcije</w:t>
-            </w:r>
-            <w:proofErr w:type="spellEnd"/>
-            <w:r>
-              <w:t xml:space="preserve"> </w:t>
-            </w:r>
-            <w:proofErr w:type="spellStart"/>
-            <w:r>
-              <w:t>promena</w:t>
-            </w:r>
-            <w:proofErr w:type="spellEnd"/>
-            <w:r>
-              <w:t xml:space="preserve"> (</w:t>
-            </w:r>
-            <w:proofErr w:type="spellStart"/>
-            <w:r>
-              <w:t>maj</w:t>
-            </w:r>
-            <w:proofErr w:type="spellEnd"/>
-            <w:r>
-              <w:t xml:space="preserve"> 2026.)</w:t>
+              <w:t>→ Implementacija detekcije promena (maj 2026.)</w:t>
             </w:r>
             <w:r>
               <w:br/>
-              <w:t xml:space="preserve">→ </w:t>
-            </w:r>
-            <w:proofErr w:type="spellStart"/>
-            <w:r>
-              <w:t>Testiranje</w:t>
-            </w:r>
-            <w:proofErr w:type="spellEnd"/>
-            <w:r>
-              <w:t xml:space="preserve"> </w:t>
-            </w:r>
-            <w:proofErr w:type="spellStart"/>
-            <w:r>
-              <w:t>sistema</w:t>
-            </w:r>
-            <w:proofErr w:type="spellEnd"/>
-            <w:r>
-              <w:t xml:space="preserve"> </w:t>
-            </w:r>
-            <w:proofErr w:type="spellStart"/>
-            <w:r>
-              <w:t>i</w:t>
-            </w:r>
-            <w:proofErr w:type="spellEnd"/>
-            <w:r>
-              <w:t xml:space="preserve"> </w:t>
-            </w:r>
-            <w:proofErr w:type="spellStart"/>
-            <w:r>
-              <w:t>analiza</w:t>
-            </w:r>
-            <w:proofErr w:type="spellEnd"/>
-            <w:r>
-              <w:t xml:space="preserve"> </w:t>
-            </w:r>
-            <w:proofErr w:type="spellStart"/>
-            <w:r>
-              <w:t>rezultata</w:t>
-            </w:r>
-            <w:proofErr w:type="spellEnd"/>
-            <w:r>
-              <w:t xml:space="preserve"> (</w:t>
-            </w:r>
-            <w:proofErr w:type="spellStart"/>
-            <w:r>
-              <w:t>jun</w:t>
-            </w:r>
-            <w:proofErr w:type="spellEnd"/>
-            <w:r>
-              <w:t xml:space="preserve"> 2026.)</w:t>
+              <w:t>→ Testiranje sistema i analiza rezultata (jun 2026.)</w:t>
             </w:r>
             <w:r>
               <w:br/>
-              <w:t xml:space="preserve">→ </w:t>
-            </w:r>
-            <w:proofErr w:type="spellStart"/>
-            <w:r>
-              <w:t>Finalizacija</w:t>
-            </w:r>
-            <w:proofErr w:type="spellEnd"/>
-            <w:r>
-              <w:t xml:space="preserve"> </w:t>
-            </w:r>
-            <w:proofErr w:type="spellStart"/>
-            <w:r>
-              <w:t>projekta</w:t>
-            </w:r>
-            <w:proofErr w:type="spellEnd"/>
-            <w:r>
-              <w:t xml:space="preserve"> </w:t>
-            </w:r>
-            <w:proofErr w:type="spellStart"/>
-            <w:r>
-              <w:t>i</w:t>
-            </w:r>
-            <w:proofErr w:type="spellEnd"/>
-            <w:r>
-              <w:t xml:space="preserve"> </w:t>
-            </w:r>
-            <w:proofErr w:type="spellStart"/>
-            <w:r>
-              <w:t>dokumentacije</w:t>
-            </w:r>
-            <w:proofErr w:type="spellEnd"/>
-            <w:r>
-              <w:t xml:space="preserve"> (</w:t>
-            </w:r>
-            <w:proofErr w:type="spellStart"/>
-            <w:r>
-              <w:t>jun</w:t>
-            </w:r>
-            <w:proofErr w:type="spellEnd"/>
-            <w:r>
-              <w:t xml:space="preserve"> 2026.)</w:t>
+              <w:t>→ Finalizacija projekta i dokumentacije (jun 2026.)</w:t>
             </w:r>
           </w:p>
         </w:tc>
@@ -1463,14 +314,12 @@
             <w:tcW w:w="4320" w:type="dxa"/>
           </w:tcPr>
           <w:p>
-            <w:proofErr w:type="spellStart"/>
             <w:r>
               <w:rPr>
                 <w:b/>
               </w:rPr>
               <w:t>Stejkholderi</w:t>
             </w:r>
-            <w:proofErr w:type="spellEnd"/>
           </w:p>
         </w:tc>
         <w:tc>
@@ -1478,133 +327,8 @@
             <w:tcW w:w="8404" w:type="dxa"/>
           </w:tcPr>
           <w:p>
-            <w:proofErr w:type="spellStart"/>
             <w:r>
-              <w:t>Studenti</w:t>
-            </w:r>
-            <w:proofErr w:type="spellEnd"/>
-            <w:r>
-              <w:t xml:space="preserve"> </w:t>
-            </w:r>
-            <w:proofErr w:type="spellStart"/>
-            <w:r>
-              <w:t>i</w:t>
-            </w:r>
-            <w:proofErr w:type="spellEnd"/>
-            <w:r>
-              <w:t xml:space="preserve"> </w:t>
-            </w:r>
-            <w:proofErr w:type="spellStart"/>
-            <w:r>
-              <w:t>profesori</w:t>
-            </w:r>
-            <w:proofErr w:type="spellEnd"/>
-            <w:r>
-              <w:t xml:space="preserve">, </w:t>
-            </w:r>
-            <w:proofErr w:type="spellStart"/>
-            <w:r>
-              <w:t>istraživači</w:t>
-            </w:r>
-            <w:proofErr w:type="spellEnd"/>
-            <w:r>
-              <w:t xml:space="preserve"> </w:t>
-            </w:r>
-            <w:proofErr w:type="spellStart"/>
-            <w:r>
-              <w:t>iz</w:t>
-            </w:r>
-            <w:proofErr w:type="spellEnd"/>
-            <w:r>
-              <w:t xml:space="preserve"> </w:t>
-            </w:r>
-            <w:proofErr w:type="spellStart"/>
-            <w:r>
-              <w:t>oblasti</w:t>
-            </w:r>
-            <w:proofErr w:type="spellEnd"/>
-            <w:r>
-              <w:t xml:space="preserve"> </w:t>
-            </w:r>
-            <w:proofErr w:type="spellStart"/>
-            <w:r>
-              <w:t>obrade</w:t>
-            </w:r>
-            <w:proofErr w:type="spellEnd"/>
-            <w:r>
-              <w:t xml:space="preserve"> </w:t>
-            </w:r>
-            <w:proofErr w:type="spellStart"/>
-            <w:r>
-              <w:t>slike</w:t>
-            </w:r>
-            <w:proofErr w:type="spellEnd"/>
-            <w:r>
-              <w:t xml:space="preserve">, </w:t>
-            </w:r>
-            <w:proofErr w:type="spellStart"/>
-            <w:r>
-              <w:t>stručnjaci</w:t>
-            </w:r>
-            <w:proofErr w:type="spellEnd"/>
-            <w:r>
-              <w:t xml:space="preserve"> za </w:t>
-            </w:r>
-            <w:proofErr w:type="spellStart"/>
-            <w:r>
-              <w:t>zaštitu</w:t>
-            </w:r>
-            <w:proofErr w:type="spellEnd"/>
-            <w:r>
-              <w:t xml:space="preserve"> </w:t>
-            </w:r>
-            <w:proofErr w:type="spellStart"/>
-            <w:r>
-              <w:t>životne</w:t>
-            </w:r>
-            <w:proofErr w:type="spellEnd"/>
-            <w:r>
-              <w:t xml:space="preserve"> </w:t>
-            </w:r>
-            <w:proofErr w:type="spellStart"/>
-            <w:r>
-              <w:t>sredine</w:t>
-            </w:r>
-            <w:proofErr w:type="spellEnd"/>
-            <w:r>
-              <w:t xml:space="preserve">, </w:t>
-            </w:r>
-            <w:proofErr w:type="spellStart"/>
-            <w:r>
-              <w:t>urbanisti</w:t>
-            </w:r>
-            <w:proofErr w:type="spellEnd"/>
-            <w:r>
-              <w:t xml:space="preserve"> </w:t>
-            </w:r>
-            <w:proofErr w:type="spellStart"/>
-            <w:r>
-              <w:t>i</w:t>
-            </w:r>
-            <w:proofErr w:type="spellEnd"/>
-            <w:r>
-              <w:t xml:space="preserve"> </w:t>
-            </w:r>
-            <w:proofErr w:type="spellStart"/>
-            <w:r>
-              <w:t>poljoprivredni</w:t>
-            </w:r>
-            <w:proofErr w:type="spellEnd"/>
-            <w:r>
-              <w:t xml:space="preserve"> </w:t>
-            </w:r>
-            <w:proofErr w:type="spellStart"/>
-            <w:r>
-              <w:t>stručnjaci</w:t>
-            </w:r>
-            <w:proofErr w:type="spellEnd"/>
-            <w:r>
-              <w:t>.</w:t>
+              <w:t>Studenti i profesori, istraživači iz oblasti obrade slike, stručnjaci za zaštitu životne sredine, urbanisti i poljoprivredni stručnjaci.</w:t>
             </w:r>
           </w:p>
         </w:tc>
@@ -1615,57 +339,13 @@
             <w:tcW w:w="4320" w:type="dxa"/>
           </w:tcPr>
           <w:p>
-            <w:proofErr w:type="spellStart"/>
             <w:r>
               <w:rPr>
                 <w:b/>
               </w:rPr>
               <w:lastRenderedPageBreak/>
-              <w:t>Pretpostavke</w:t>
+              <w:t>Pretpostavke, ograničenja i rizici</w:t>
             </w:r>
-            <w:proofErr w:type="spellEnd"/>
-            <w:r>
-              <w:rPr>
-                <w:b/>
-              </w:rPr>
-              <w:t xml:space="preserve">, </w:t>
-            </w:r>
-            <w:proofErr w:type="spellStart"/>
-            <w:r>
-              <w:rPr>
-                <w:b/>
-              </w:rPr>
-              <w:t>ograničenja</w:t>
-            </w:r>
-            <w:proofErr w:type="spellEnd"/>
-            <w:r>
-              <w:rPr>
-                <w:b/>
-              </w:rPr>
-              <w:t xml:space="preserve"> </w:t>
-            </w:r>
-            <w:proofErr w:type="spellStart"/>
-            <w:r>
-              <w:rPr>
-                <w:b/>
-              </w:rPr>
-              <w:t>i</w:t>
-            </w:r>
-            <w:proofErr w:type="spellEnd"/>
-            <w:r>
-              <w:rPr>
-                <w:b/>
-              </w:rPr>
-              <w:t xml:space="preserve"> </w:t>
-            </w:r>
-            <w:proofErr w:type="spellStart"/>
-            <w:r>
-              <w:rPr>
-                <w:b/>
-              </w:rPr>
-              <w:t>rizici</w:t>
-            </w:r>
-            <w:proofErr w:type="spellEnd"/>
           </w:p>
         </w:tc>
         <w:tc>
@@ -1673,157 +353,8 @@
             <w:tcW w:w="8404" w:type="dxa"/>
           </w:tcPr>
           <w:p>
-            <w:proofErr w:type="spellStart"/>
             <w:r>
-              <w:t>Dostupnost</w:t>
-            </w:r>
-            <w:proofErr w:type="spellEnd"/>
-            <w:r>
-              <w:t xml:space="preserve"> </w:t>
-            </w:r>
-            <w:proofErr w:type="spellStart"/>
-            <w:r>
-              <w:t>kvalitetnih</w:t>
-            </w:r>
-            <w:proofErr w:type="spellEnd"/>
-            <w:r>
-              <w:t xml:space="preserve"> </w:t>
-            </w:r>
-            <w:proofErr w:type="spellStart"/>
-            <w:r>
-              <w:t>dron</w:t>
-            </w:r>
-            <w:proofErr w:type="spellEnd"/>
-            <w:r>
-              <w:t xml:space="preserve"> </w:t>
-            </w:r>
-            <w:proofErr w:type="spellStart"/>
-            <w:r>
-              <w:t>snimaka</w:t>
-            </w:r>
-            <w:proofErr w:type="spellEnd"/>
-            <w:r>
-              <w:t xml:space="preserve"> / </w:t>
-            </w:r>
-            <w:proofErr w:type="spellStart"/>
-            <w:r>
-              <w:t>ograničeni</w:t>
-            </w:r>
-            <w:proofErr w:type="spellEnd"/>
-            <w:r>
-              <w:t xml:space="preserve"> </w:t>
-            </w:r>
-            <w:proofErr w:type="spellStart"/>
-            <w:r>
-              <w:t>računski</w:t>
-            </w:r>
-            <w:proofErr w:type="spellEnd"/>
-            <w:r>
-              <w:t xml:space="preserve"> </w:t>
-            </w:r>
-            <w:proofErr w:type="spellStart"/>
-            <w:r>
-              <w:t>resursi</w:t>
-            </w:r>
-            <w:proofErr w:type="spellEnd"/>
-            <w:r>
-              <w:t xml:space="preserve"> </w:t>
-            </w:r>
-            <w:proofErr w:type="spellStart"/>
-            <w:r>
-              <w:t>na</w:t>
-            </w:r>
-            <w:proofErr w:type="spellEnd"/>
-            <w:r>
-              <w:t xml:space="preserve"> ARM </w:t>
-            </w:r>
-            <w:proofErr w:type="spellStart"/>
-            <w:r>
-              <w:t>uređajima</w:t>
-            </w:r>
-            <w:proofErr w:type="spellEnd"/>
-            <w:r>
-              <w:t xml:space="preserve"> / </w:t>
-            </w:r>
-            <w:proofErr w:type="spellStart"/>
-            <w:r>
-              <w:t>moguća</w:t>
-            </w:r>
-            <w:proofErr w:type="spellEnd"/>
-            <w:r>
-              <w:t xml:space="preserve"> </w:t>
-            </w:r>
-            <w:proofErr w:type="spellStart"/>
-            <w:r>
-              <w:t>netačnost</w:t>
-            </w:r>
-            <w:proofErr w:type="spellEnd"/>
-            <w:r>
-              <w:t xml:space="preserve"> </w:t>
-            </w:r>
-            <w:proofErr w:type="spellStart"/>
-            <w:r>
-              <w:t>algoritma</w:t>
-            </w:r>
-            <w:proofErr w:type="spellEnd"/>
-            <w:r>
-              <w:t xml:space="preserve"> u </w:t>
-            </w:r>
-            <w:proofErr w:type="spellStart"/>
-            <w:r>
-              <w:t>slučaju</w:t>
-            </w:r>
-            <w:proofErr w:type="spellEnd"/>
-            <w:r>
-              <w:t xml:space="preserve"> </w:t>
-            </w:r>
-            <w:proofErr w:type="spellStart"/>
-            <w:r>
-              <w:t>velikih</w:t>
-            </w:r>
-            <w:proofErr w:type="spellEnd"/>
-            <w:r>
-              <w:t xml:space="preserve"> </w:t>
-            </w:r>
-            <w:proofErr w:type="spellStart"/>
-            <w:r>
-              <w:t>promena</w:t>
-            </w:r>
-            <w:proofErr w:type="spellEnd"/>
-            <w:r>
-              <w:t xml:space="preserve"> </w:t>
-            </w:r>
-            <w:proofErr w:type="spellStart"/>
-            <w:r>
-              <w:t>osvetljenja</w:t>
-            </w:r>
-            <w:proofErr w:type="spellEnd"/>
-            <w:r>
-              <w:t xml:space="preserve"> </w:t>
-            </w:r>
-            <w:proofErr w:type="spellStart"/>
-            <w:r>
-              <w:t>ili</w:t>
-            </w:r>
-            <w:proofErr w:type="spellEnd"/>
-            <w:r>
-              <w:t xml:space="preserve"> </w:t>
-            </w:r>
-            <w:proofErr w:type="spellStart"/>
-            <w:r>
-              <w:t>ugla</w:t>
-            </w:r>
-            <w:proofErr w:type="spellEnd"/>
-            <w:r>
-              <w:t xml:space="preserve"> </w:t>
-            </w:r>
-            <w:proofErr w:type="spellStart"/>
-            <w:r>
-              <w:t>snimanja</w:t>
-            </w:r>
-            <w:proofErr w:type="spellEnd"/>
-            <w:r>
-              <w:t>.</w:t>
+              <w:t>Dostupnost kvalitetnih dron snimaka / ograničeni računski resursi na ARM uređajima / moguća netačnost algoritma u slučaju velikih promena osvetljenja ili ugla snimanja.</w:t>
             </w:r>
           </w:p>
         </w:tc>
@@ -1834,28 +365,12 @@
             <w:tcW w:w="4320" w:type="dxa"/>
           </w:tcPr>
           <w:p>
-            <w:proofErr w:type="spellStart"/>
             <w:r>
               <w:rPr>
                 <w:b/>
               </w:rPr>
-              <w:t>Kontakt</w:t>
+              <w:t>Kontakt osoba</w:t>
             </w:r>
-            <w:proofErr w:type="spellEnd"/>
-            <w:r>
-              <w:rPr>
-                <w:b/>
-              </w:rPr>
-              <w:t xml:space="preserve"> </w:t>
-            </w:r>
-            <w:proofErr w:type="spellStart"/>
-            <w:r>
-              <w:rPr>
-                <w:b/>
-              </w:rPr>
-              <w:t>osoba</w:t>
-            </w:r>
-            <w:proofErr w:type="spellEnd"/>
           </w:p>
         </w:tc>
         <w:tc>
@@ -1867,13 +382,8 @@
               <w:t>Aleksandar Vuletić</w:t>
             </w:r>
             <w:r>
-              <w:t xml:space="preserve">, projekt </w:t>
+              <w:t>, projekt menadžer</w:t>
             </w:r>
-            <w:proofErr w:type="spellStart"/>
-            <w:r>
-              <w:t>menadžer</w:t>
-            </w:r>
-            <w:proofErr w:type="spellEnd"/>
             <w:r>
               <w:br/>
               <w:t xml:space="preserve">email: </w:t>

</xml_diff>